<commit_message>
Ajuste en el archivo del proyecto
</commit_message>
<xml_diff>
--- a/Proyecto/Proyecto Avance 3.docx
+++ b/Proyecto/Proyecto Avance 3.docx
@@ -568,23 +568,7 @@
                 <w:sz w:val="20"/>
                 <w:szCs w:val="20"/>
               </w:rPr>
-              <w:t>No se permite el uso de Inteligencias Artificiales (</w:t>
-            </w:r>
-            <w:proofErr w:type="spellStart"/>
-            <w:r>
-              <w:rPr>
-                <w:sz w:val="20"/>
-                <w:szCs w:val="20"/>
-              </w:rPr>
-              <w:t>ChatGPT</w:t>
-            </w:r>
-            <w:proofErr w:type="spellEnd"/>
-            <w:r>
-              <w:rPr>
-                <w:sz w:val="20"/>
-                <w:szCs w:val="20"/>
-              </w:rPr>
-              <w:t xml:space="preserve"> o similares).</w:t>
+              <w:t>No se permite el uso de Inteligencias Artificiales (ChatGPT o similares).</w:t>
             </w:r>
           </w:p>
           <w:p>
@@ -683,23 +667,7 @@
                 <w:sz w:val="20"/>
                 <w:szCs w:val="20"/>
               </w:rPr>
-              <w:t xml:space="preserve">2 funciones completas y mínimo 3 </w:t>
-            </w:r>
-            <w:proofErr w:type="spellStart"/>
-            <w:r>
-              <w:rPr>
-                <w:sz w:val="20"/>
-                <w:szCs w:val="20"/>
-              </w:rPr>
-              <w:t>commits</w:t>
-            </w:r>
-            <w:proofErr w:type="spellEnd"/>
-            <w:r>
-              <w:rPr>
-                <w:sz w:val="20"/>
-                <w:szCs w:val="20"/>
-              </w:rPr>
-              <w:t xml:space="preserve"> en los repositorios en el proyecto para hacer valido su participación en el grupo.</w:t>
+              <w:t>2 funciones completas y mínimo 3 commits en los repositorios en el proyecto para hacer valido su participación en el grupo.</w:t>
             </w:r>
           </w:p>
           <w:p>
@@ -1242,21 +1210,7 @@
         <w:rPr>
           <w:lang w:val="es-CR"/>
         </w:rPr>
-        <w:t xml:space="preserve">Utilizando el Agent de SQL Server, deberán de realizar una ejecución automatizada de </w:t>
-      </w:r>
-      <w:proofErr w:type="spellStart"/>
-      <w:r>
-        <w:rPr>
-          <w:lang w:val="es-CR"/>
-        </w:rPr>
-        <w:t>backups</w:t>
-      </w:r>
-      <w:proofErr w:type="spellEnd"/>
-      <w:r>
-        <w:rPr>
-          <w:lang w:val="es-CR"/>
-        </w:rPr>
-        <w:t>, donde se deberá de realizar dos Jobs como mínimo.</w:t>
+        <w:t>Utilizando el Agent de SQL Server, deberán de realizar una ejecución automatizada de backups, donde se deberá de realizar dos Jobs como mínimo.</w:t>
       </w:r>
     </w:p>
     <w:p>
@@ -1287,29 +1241,7 @@
         <w:rPr>
           <w:lang w:val="es-CR"/>
         </w:rPr>
-        <w:t xml:space="preserve">Cada semana los sábados a las 6 pm, cuando la empresa ya cerró en su totalidad y los usuarios no utilizaran el sistema, se deberá de realizar </w:t>
-      </w:r>
-      <w:proofErr w:type="gramStart"/>
-      <w:r>
-        <w:rPr>
-          <w:lang w:val="es-CR"/>
-        </w:rPr>
-        <w:t xml:space="preserve">un </w:t>
-      </w:r>
-      <w:proofErr w:type="spellStart"/>
-      <w:r>
-        <w:rPr>
-          <w:lang w:val="es-CR"/>
-        </w:rPr>
-        <w:t>backup</w:t>
-      </w:r>
-      <w:proofErr w:type="spellEnd"/>
-      <w:proofErr w:type="gramEnd"/>
-      <w:r>
-        <w:rPr>
-          <w:lang w:val="es-CR"/>
-        </w:rPr>
-        <w:t xml:space="preserve"> </w:t>
+        <w:t xml:space="preserve">Cada semana los sábados a las 6 pm, cuando la empresa ya cerró en su totalidad y los usuarios no utilizaran el sistema, se deberá de realizar un backup </w:t>
       </w:r>
       <w:r>
         <w:rPr>
@@ -1339,41 +1271,25 @@
         <w:rPr>
           <w:lang w:val="es-CR"/>
         </w:rPr>
-        <w:t xml:space="preserve">Job para respaldo incremental de la base de datos: Cada día al finalizar la jornada a las 9 pm, se deberá de ejecutar un </w:t>
-      </w:r>
-      <w:proofErr w:type="spellStart"/>
-      <w:r>
-        <w:rPr>
-          <w:lang w:val="es-CR"/>
-        </w:rPr>
-        <w:t>job</w:t>
-      </w:r>
-      <w:proofErr w:type="spellEnd"/>
-      <w:r>
-        <w:rPr>
-          <w:lang w:val="es-CR"/>
-        </w:rPr>
-        <w:t xml:space="preserve"> automático que permita realizar</w:t>
-      </w:r>
-      <w:r>
-        <w:rPr>
-          <w:lang w:val="es-CR"/>
-        </w:rPr>
-        <w:t xml:space="preserve"> un respaldo incremental de la base de datos basado en el ultimo </w:t>
-      </w:r>
-      <w:proofErr w:type="spellStart"/>
-      <w:r>
-        <w:rPr>
-          <w:lang w:val="es-CR"/>
-        </w:rPr>
-        <w:t>backup</w:t>
-      </w:r>
-      <w:proofErr w:type="spellEnd"/>
-      <w:r>
-        <w:rPr>
-          <w:lang w:val="es-CR"/>
-        </w:rPr>
-        <w:t xml:space="preserve"> completo realizado de la base de datos.</w:t>
+        <w:t>Job para respaldo incremental de la base de datos: Cada día al finalizar la jornada a las 9 pm, se deberá de ejecutar un job automático que permita realizar</w:t>
+      </w:r>
+      <w:r>
+        <w:rPr>
+          <w:lang w:val="es-CR"/>
+        </w:rPr>
+        <w:t xml:space="preserve"> un respaldo incremental de la base de datos basado en el </w:t>
+      </w:r>
+      <w:r>
+        <w:rPr>
+          <w:lang w:val="es-CR"/>
+        </w:rPr>
+        <w:t>último</w:t>
+      </w:r>
+      <w:r>
+        <w:rPr>
+          <w:lang w:val="es-CR"/>
+        </w:rPr>
+        <w:t xml:space="preserve"> backup completo realizado de la base de datos.</w:t>
       </w:r>
     </w:p>
     <w:p>
@@ -1413,69 +1329,31 @@
         <w:rPr>
           <w:lang w:val="es-CR"/>
         </w:rPr>
-        <w:t xml:space="preserve"> no caiga sobre el anterior haciendo que </w:t>
-      </w:r>
-      <w:proofErr w:type="gramStart"/>
-      <w:r>
-        <w:rPr>
-          <w:lang w:val="es-CR"/>
-        </w:rPr>
-        <w:t xml:space="preserve">cada </w:t>
-      </w:r>
-      <w:proofErr w:type="spellStart"/>
-      <w:r>
-        <w:rPr>
-          <w:lang w:val="es-CR"/>
-        </w:rPr>
-        <w:t>backup</w:t>
-      </w:r>
-      <w:proofErr w:type="spellEnd"/>
-      <w:proofErr w:type="gramEnd"/>
-      <w:r>
-        <w:rPr>
-          <w:lang w:val="es-CR"/>
-        </w:rPr>
-        <w:t xml:space="preserve"> el respaldo aumente su tamaño exponencialmente</w:t>
-      </w:r>
-      <w:r>
-        <w:rPr>
-          <w:lang w:val="es-CR"/>
-        </w:rPr>
-        <w:t xml:space="preserve">, principalmente para respaldos completos. Cada Job deberá de ejecutar un SP y no su </w:t>
-      </w:r>
-      <w:proofErr w:type="spellStart"/>
-      <w:r>
-        <w:rPr>
-          <w:lang w:val="es-CR"/>
-        </w:rPr>
-        <w:t>scrip</w:t>
-      </w:r>
-      <w:proofErr w:type="spellEnd"/>
-      <w:r>
-        <w:rPr>
-          <w:lang w:val="es-CR"/>
-        </w:rPr>
-        <w:t xml:space="preserve"> directo.</w:t>
-      </w:r>
-      <w:r>
-        <w:rPr>
-          <w:lang w:val="es-CR"/>
-        </w:rPr>
-        <w:t xml:space="preserve"> Para finalizar cada Job deben de investigar como generar alertas para informar a los administradores de base de datos cuando los </w:t>
-      </w:r>
-      <w:proofErr w:type="spellStart"/>
-      <w:r>
-        <w:rPr>
-          <w:lang w:val="es-CR"/>
-        </w:rPr>
-        <w:t>backups</w:t>
-      </w:r>
-      <w:proofErr w:type="spellEnd"/>
-      <w:r>
-        <w:rPr>
-          <w:lang w:val="es-CR"/>
-        </w:rPr>
-        <w:t xml:space="preserve"> produzcan errores para su análisis y corrección.</w:t>
+        <w:t xml:space="preserve"> no caiga sobre el anterior haciendo que cada backup el respaldo aumente su tamaño exponencialmente</w:t>
+      </w:r>
+      <w:r>
+        <w:rPr>
+          <w:lang w:val="es-CR"/>
+        </w:rPr>
+        <w:t>, principalmente para respaldos completos</w:t>
+      </w:r>
+      <w:r>
+        <w:rPr>
+          <w:lang w:val="es-CR"/>
+        </w:rPr>
+        <w:t xml:space="preserve"> y el los archivos de backup deben de agregarse en repositorio</w:t>
+      </w:r>
+      <w:r>
+        <w:rPr>
+          <w:lang w:val="es-CR"/>
+        </w:rPr>
+        <w:t>. Cada Job deberá de ejecutar un SP y no su scrip directo.</w:t>
+      </w:r>
+      <w:r>
+        <w:rPr>
+          <w:lang w:val="es-CR"/>
+        </w:rPr>
+        <w:t xml:space="preserve"> Para finalizar cada Job deben de investigar como generar alertas para informar a los administradores de base de datos cuando los backups produzcan errores para su análisis y corrección.</w:t>
       </w:r>
     </w:p>
     <w:p>
@@ -1528,33 +1406,7 @@
           <w:szCs w:val="22"/>
           <w:lang w:val="es-CR"/>
         </w:rPr>
-        <w:t xml:space="preserve">una ventana en SQL </w:t>
-      </w:r>
-      <w:proofErr w:type="spellStart"/>
-      <w:r>
-        <w:rPr>
-          <w:rFonts w:ascii="Arial" w:hAnsi="Arial" w:cs="Arial"/>
-          <w:b/>
-          <w:bCs/>
-          <w:color w:val="auto"/>
-          <w:sz w:val="22"/>
-          <w:szCs w:val="22"/>
-          <w:lang w:val="es-CR"/>
-        </w:rPr>
-        <w:t>Profiler</w:t>
-      </w:r>
-      <w:proofErr w:type="spellEnd"/>
-      <w:r>
-        <w:rPr>
-          <w:rFonts w:ascii="Arial" w:hAnsi="Arial" w:cs="Arial"/>
-          <w:b/>
-          <w:bCs/>
-          <w:color w:val="auto"/>
-          <w:sz w:val="22"/>
-          <w:szCs w:val="22"/>
-          <w:lang w:val="es-CR"/>
-        </w:rPr>
-        <w:t xml:space="preserve"> para monitorear los respaldos</w:t>
+        <w:t>una ventana en SQL Profiler para monitorear los respaldos</w:t>
       </w:r>
     </w:p>
     <w:p>
@@ -1582,16 +1434,8 @@
         <w:rPr>
           <w:lang w:val="es-CR"/>
         </w:rPr>
-        <w:t xml:space="preserve">SQL </w:t>
-      </w:r>
-      <w:proofErr w:type="spellStart"/>
-      <w:r>
-        <w:rPr>
-          <w:lang w:val="es-CR"/>
-        </w:rPr>
-        <w:t>Profiler</w:t>
-      </w:r>
-      <w:proofErr w:type="spellEnd"/>
+        <w:t>SQL Profiler</w:t>
+      </w:r>
       <w:r>
         <w:rPr>
           <w:lang w:val="es-CR"/>
@@ -1602,21 +1446,7 @@
         <w:rPr>
           <w:lang w:val="es-CR"/>
         </w:rPr>
-        <w:t xml:space="preserve">plantilla para monitorear únicamente filtrados las ejecuciones de los </w:t>
-      </w:r>
-      <w:proofErr w:type="spellStart"/>
-      <w:r>
-        <w:rPr>
-          <w:lang w:val="es-CR"/>
-        </w:rPr>
-        <w:t>backups</w:t>
-      </w:r>
-      <w:proofErr w:type="spellEnd"/>
-      <w:r>
-        <w:rPr>
-          <w:lang w:val="es-CR"/>
-        </w:rPr>
-        <w:t xml:space="preserve"> para asegurar el monitoreo de cada uno de estos</w:t>
+        <w:t>plantilla para monitorear únicamente filtrados las ejecuciones de los backups para asegurar el monitoreo de cada uno de estos</w:t>
       </w:r>
       <w:r>
         <w:rPr>
@@ -1995,29 +1825,7 @@
           <w:szCs w:val="22"/>
           <w:lang w:val="es-CR"/>
         </w:rPr>
-        <w:t xml:space="preserve"> </w:t>
-      </w:r>
-      <w:proofErr w:type="spellStart"/>
-      <w:r>
-        <w:rPr>
-          <w:rFonts w:ascii="Arial" w:hAnsi="Arial" w:cs="Arial"/>
-          <w:color w:val="auto"/>
-          <w:sz w:val="22"/>
-          <w:szCs w:val="22"/>
-          <w:lang w:val="es-CR"/>
-        </w:rPr>
-        <w:t>pts</w:t>
-      </w:r>
-      <w:proofErr w:type="spellEnd"/>
-      <w:r>
-        <w:rPr>
-          <w:rFonts w:ascii="Arial" w:hAnsi="Arial" w:cs="Arial"/>
-          <w:color w:val="auto"/>
-          <w:sz w:val="22"/>
-          <w:szCs w:val="22"/>
-          <w:lang w:val="es-CR"/>
-        </w:rPr>
-        <w:t>)</w:t>
+        <w:t xml:space="preserve"> pts)</w:t>
       </w:r>
     </w:p>
     <w:p>
@@ -2072,27 +1880,7 @@
           <w:szCs w:val="22"/>
           <w:lang w:val="es-CR"/>
         </w:rPr>
-        <w:t xml:space="preserve">l análisis para evitar el colapso de espacio por </w:t>
-      </w:r>
-      <w:proofErr w:type="spellStart"/>
-      <w:r>
-        <w:rPr>
-          <w:rFonts w:ascii="Arial" w:hAnsi="Arial" w:cs="Arial"/>
-          <w:sz w:val="22"/>
-          <w:szCs w:val="22"/>
-          <w:lang w:val="es-CR"/>
-        </w:rPr>
-        <w:t>backups</w:t>
-      </w:r>
-      <w:proofErr w:type="spellEnd"/>
-      <w:r>
-        <w:rPr>
-          <w:rFonts w:ascii="Arial" w:hAnsi="Arial" w:cs="Arial"/>
-          <w:sz w:val="22"/>
-          <w:szCs w:val="22"/>
-          <w:lang w:val="es-CR"/>
-        </w:rPr>
-        <w:t>.</w:t>
+        <w:t>l análisis para evitar el colapso de espacio por backups.</w:t>
       </w:r>
     </w:p>
     <w:p>
@@ -2117,19 +1905,8 @@
           <w:szCs w:val="22"/>
           <w:lang w:val="es-CR"/>
         </w:rPr>
-        <w:t xml:space="preserve">Detalle técnico de los </w:t>
-      </w:r>
-      <w:proofErr w:type="spellStart"/>
-      <w:r>
-        <w:rPr>
-          <w:rFonts w:ascii="Arial" w:hAnsi="Arial" w:cs="Arial"/>
-          <w:sz w:val="22"/>
-          <w:szCs w:val="22"/>
-          <w:lang w:val="es-CR"/>
-        </w:rPr>
-        <w:t>backups</w:t>
-      </w:r>
-      <w:proofErr w:type="spellEnd"/>
+        <w:t>Detalle técnico de los backups</w:t>
+      </w:r>
       <w:r>
         <w:rPr>
           <w:rFonts w:ascii="Arial" w:hAnsi="Arial" w:cs="Arial"/>
@@ -2155,27 +1932,7 @@
           <w:szCs w:val="22"/>
           <w:lang w:val="es-CR"/>
         </w:rPr>
-        <w:t xml:space="preserve"> (Imágenes del </w:t>
-      </w:r>
-      <w:proofErr w:type="spellStart"/>
-      <w:r>
-        <w:rPr>
-          <w:rFonts w:ascii="Arial" w:hAnsi="Arial" w:cs="Arial"/>
-          <w:sz w:val="22"/>
-          <w:szCs w:val="22"/>
-          <w:lang w:val="es-CR"/>
-        </w:rPr>
-        <w:t>agent</w:t>
-      </w:r>
-      <w:proofErr w:type="spellEnd"/>
-      <w:r>
-        <w:rPr>
-          <w:rFonts w:ascii="Arial" w:hAnsi="Arial" w:cs="Arial"/>
-          <w:sz w:val="22"/>
-          <w:szCs w:val="22"/>
-          <w:lang w:val="es-CR"/>
-        </w:rPr>
-        <w:t>)</w:t>
+        <w:t xml:space="preserve"> (Imágenes del agent)</w:t>
       </w:r>
       <w:r>
         <w:rPr>
@@ -2209,76 +1966,16 @@
           <w:szCs w:val="22"/>
           <w:lang w:val="es-CR"/>
         </w:rPr>
-        <w:t xml:space="preserve">Detalle técnico del monitoreo con </w:t>
-      </w:r>
-      <w:proofErr w:type="spellStart"/>
-      <w:r>
-        <w:rPr>
-          <w:rFonts w:ascii="Arial" w:hAnsi="Arial" w:cs="Arial"/>
-          <w:sz w:val="22"/>
-          <w:szCs w:val="22"/>
-          <w:lang w:val="es-CR"/>
-        </w:rPr>
-        <w:t>profiler</w:t>
-      </w:r>
-      <w:proofErr w:type="spellEnd"/>
-      <w:r>
-        <w:rPr>
-          <w:rFonts w:ascii="Arial" w:hAnsi="Arial" w:cs="Arial"/>
-          <w:sz w:val="22"/>
-          <w:szCs w:val="22"/>
-          <w:lang w:val="es-CR"/>
-        </w:rPr>
-        <w:t xml:space="preserve"> de los </w:t>
-      </w:r>
-      <w:proofErr w:type="spellStart"/>
-      <w:r>
-        <w:rPr>
-          <w:rFonts w:ascii="Arial" w:hAnsi="Arial" w:cs="Arial"/>
-          <w:sz w:val="22"/>
-          <w:szCs w:val="22"/>
-          <w:lang w:val="es-CR"/>
-        </w:rPr>
-        <w:t>backups</w:t>
-      </w:r>
-      <w:proofErr w:type="spellEnd"/>
-      <w:r>
-        <w:rPr>
-          <w:rFonts w:ascii="Arial" w:hAnsi="Arial" w:cs="Arial"/>
-          <w:sz w:val="22"/>
-          <w:szCs w:val="22"/>
-          <w:lang w:val="es-CR"/>
-        </w:rPr>
-        <w:t xml:space="preserve"> realizados</w:t>
-      </w:r>
-      <w:r>
-        <w:rPr>
-          <w:rFonts w:ascii="Arial" w:hAnsi="Arial" w:cs="Arial"/>
-          <w:sz w:val="22"/>
-          <w:szCs w:val="22"/>
-          <w:lang w:val="es-CR"/>
-        </w:rPr>
-        <w:t xml:space="preserve"> (Imágenes del </w:t>
-      </w:r>
-      <w:proofErr w:type="spellStart"/>
-      <w:r>
-        <w:rPr>
-          <w:rFonts w:ascii="Arial" w:hAnsi="Arial" w:cs="Arial"/>
-          <w:sz w:val="22"/>
-          <w:szCs w:val="22"/>
-          <w:lang w:val="es-CR"/>
-        </w:rPr>
-        <w:t>profiler</w:t>
-      </w:r>
-      <w:proofErr w:type="spellEnd"/>
-      <w:r>
-        <w:rPr>
-          <w:rFonts w:ascii="Arial" w:hAnsi="Arial" w:cs="Arial"/>
-          <w:sz w:val="22"/>
-          <w:szCs w:val="22"/>
-          <w:lang w:val="es-CR"/>
-        </w:rPr>
-        <w:t>)</w:t>
+        <w:t>Detalle técnico del monitoreo con profiler de los backups realizados</w:t>
+      </w:r>
+      <w:r>
+        <w:rPr>
+          <w:rFonts w:ascii="Arial" w:hAnsi="Arial" w:cs="Arial"/>
+          <w:sz w:val="22"/>
+          <w:szCs w:val="22"/>
+          <w:lang w:val="es-CR"/>
+        </w:rPr>
+        <w:t xml:space="preserve"> (Imágenes del profiler)</w:t>
       </w:r>
       <w:r>
         <w:rPr>
@@ -2328,7 +2025,7 @@
         </w:rPr>
         <w:lastRenderedPageBreak/>
         <w:pict w14:anchorId="2520B230">
-          <v:rect id="_x0000_i1082" style="width:0;height:1.5pt" o:hralign="center" o:hrstd="t" o:hr="t"/>
+          <v:rect id="_x0000_i1026" style="width:0;height:1.5pt" o:hralign="center" o:hrstd="t" o:hr="t"/>
         </w:pict>
       </w:r>
     </w:p>
@@ -2354,29 +2051,7 @@
           <w:szCs w:val="22"/>
           <w:lang w:val="es-CR"/>
         </w:rPr>
-        <w:t xml:space="preserve">2. Script SQL Completo (45 </w:t>
-      </w:r>
-      <w:proofErr w:type="spellStart"/>
-      <w:r>
-        <w:rPr>
-          <w:rFonts w:ascii="Arial" w:hAnsi="Arial" w:cs="Arial"/>
-          <w:color w:val="auto"/>
-          <w:sz w:val="22"/>
-          <w:szCs w:val="22"/>
-          <w:lang w:val="es-CR"/>
-        </w:rPr>
-        <w:t>pts</w:t>
-      </w:r>
-      <w:proofErr w:type="spellEnd"/>
-      <w:r>
-        <w:rPr>
-          <w:rFonts w:ascii="Arial" w:hAnsi="Arial" w:cs="Arial"/>
-          <w:color w:val="auto"/>
-          <w:sz w:val="22"/>
-          <w:szCs w:val="22"/>
-          <w:lang w:val="es-CR"/>
-        </w:rPr>
-        <w:t>)</w:t>
+        <w:t>2. Script SQL Completo (45 pts)</w:t>
       </w:r>
     </w:p>
     <w:p>
@@ -2415,45 +2090,14 @@
           <w:lang w:val="es-CR"/>
         </w:rPr>
       </w:pPr>
-      <w:proofErr w:type="spellStart"/>
-      <w:r>
-        <w:rPr>
-          <w:rFonts w:ascii="Arial" w:hAnsi="Arial" w:cs="Arial"/>
-          <w:sz w:val="22"/>
-          <w:szCs w:val="22"/>
-          <w:lang w:val="es-CR"/>
-        </w:rPr>
-        <w:t>SPs</w:t>
-      </w:r>
-      <w:proofErr w:type="spellEnd"/>
-      <w:r>
-        <w:rPr>
-          <w:rFonts w:ascii="Arial" w:hAnsi="Arial" w:cs="Arial"/>
-          <w:sz w:val="22"/>
-          <w:szCs w:val="22"/>
-          <w:lang w:val="es-CR"/>
-        </w:rPr>
-        <w:t xml:space="preserve"> de los </w:t>
-      </w:r>
-      <w:proofErr w:type="spellStart"/>
-      <w:r>
-        <w:rPr>
-          <w:rFonts w:ascii="Arial" w:hAnsi="Arial" w:cs="Arial"/>
-          <w:sz w:val="22"/>
-          <w:szCs w:val="22"/>
-          <w:lang w:val="es-CR"/>
-        </w:rPr>
-        <w:t>backups</w:t>
-      </w:r>
-      <w:proofErr w:type="spellEnd"/>
-      <w:r>
-        <w:rPr>
-          <w:rFonts w:ascii="Arial" w:hAnsi="Arial" w:cs="Arial"/>
-          <w:sz w:val="22"/>
-          <w:szCs w:val="22"/>
-          <w:lang w:val="es-CR"/>
-        </w:rPr>
-        <w:t xml:space="preserve"> realizados</w:t>
+      <w:r>
+        <w:rPr>
+          <w:rFonts w:ascii="Arial" w:hAnsi="Arial" w:cs="Arial"/>
+          <w:sz w:val="22"/>
+          <w:szCs w:val="22"/>
+          <w:lang w:val="es-CR"/>
+        </w:rPr>
+        <w:t>SPs de los backups realizados</w:t>
       </w:r>
       <w:r>
         <w:rPr>
@@ -2480,25 +2124,14 @@
           <w:lang w:val="es-CR"/>
         </w:rPr>
       </w:pPr>
-      <w:proofErr w:type="spellStart"/>
-      <w:r>
-        <w:rPr>
-          <w:rFonts w:ascii="Arial" w:hAnsi="Arial" w:cs="Arial"/>
-          <w:sz w:val="22"/>
-          <w:szCs w:val="22"/>
-          <w:lang w:val="es-CR"/>
-        </w:rPr>
-        <w:t>Scrips</w:t>
-      </w:r>
-      <w:proofErr w:type="spellEnd"/>
-      <w:r>
-        <w:rPr>
-          <w:rFonts w:ascii="Arial" w:hAnsi="Arial" w:cs="Arial"/>
-          <w:sz w:val="22"/>
-          <w:szCs w:val="22"/>
-          <w:lang w:val="es-CR"/>
-        </w:rPr>
-        <w:t xml:space="preserve"> completos de la base de datos</w:t>
+      <w:r>
+        <w:rPr>
+          <w:rFonts w:ascii="Arial" w:hAnsi="Arial" w:cs="Arial"/>
+          <w:sz w:val="22"/>
+          <w:szCs w:val="22"/>
+          <w:lang w:val="es-CR"/>
+        </w:rPr>
+        <w:t>Scrips completos de la base de datos</w:t>
       </w:r>
     </w:p>
     <w:p>
@@ -2538,7 +2171,7 @@
           <w:lang w:val="es-CR"/>
         </w:rPr>
         <w:pict w14:anchorId="7260AA69">
-          <v:rect id="_x0000_i1083" style="width:0;height:1.5pt" o:hralign="center" o:hrstd="t" o:hr="t"/>
+          <v:rect id="_x0000_i1027" style="width:0;height:1.5pt" o:hralign="center" o:hrstd="t" o:hr="t"/>
         </w:pict>
       </w:r>
     </w:p>
@@ -2564,29 +2197,7 @@
           <w:szCs w:val="22"/>
           <w:lang w:val="es-CR"/>
         </w:rPr>
-        <w:t xml:space="preserve">3. Código Fuente (20 </w:t>
-      </w:r>
-      <w:proofErr w:type="spellStart"/>
-      <w:r>
-        <w:rPr>
-          <w:rFonts w:ascii="Arial" w:hAnsi="Arial" w:cs="Arial"/>
-          <w:color w:val="auto"/>
-          <w:sz w:val="22"/>
-          <w:szCs w:val="22"/>
-          <w:lang w:val="es-CR"/>
-        </w:rPr>
-        <w:t>pts</w:t>
-      </w:r>
-      <w:proofErr w:type="spellEnd"/>
-      <w:r>
-        <w:rPr>
-          <w:rFonts w:ascii="Arial" w:hAnsi="Arial" w:cs="Arial"/>
-          <w:color w:val="auto"/>
-          <w:sz w:val="22"/>
-          <w:szCs w:val="22"/>
-          <w:lang w:val="es-CR"/>
-        </w:rPr>
-        <w:t>)</w:t>
+        <w:t>3. Código Fuente (20 pts)</w:t>
       </w:r>
     </w:p>
     <w:p>
@@ -2657,47 +2268,7 @@
           <w:szCs w:val="22"/>
           <w:lang w:val="es-CR"/>
         </w:rPr>
-        <w:t xml:space="preserve">Uso de </w:t>
-      </w:r>
-      <w:proofErr w:type="spellStart"/>
-      <w:r>
-        <w:rPr>
-          <w:rFonts w:ascii="Arial" w:hAnsi="Arial" w:cs="Arial"/>
-          <w:sz w:val="22"/>
-          <w:szCs w:val="22"/>
-          <w:lang w:val="es-CR"/>
-        </w:rPr>
-        <w:t>Stored</w:t>
-      </w:r>
-      <w:proofErr w:type="spellEnd"/>
-      <w:r>
-        <w:rPr>
-          <w:rFonts w:ascii="Arial" w:hAnsi="Arial" w:cs="Arial"/>
-          <w:sz w:val="22"/>
-          <w:szCs w:val="22"/>
-          <w:lang w:val="es-CR"/>
-        </w:rPr>
-        <w:t xml:space="preserve"> </w:t>
-      </w:r>
-      <w:proofErr w:type="spellStart"/>
-      <w:r>
-        <w:rPr>
-          <w:rFonts w:ascii="Arial" w:hAnsi="Arial" w:cs="Arial"/>
-          <w:sz w:val="22"/>
-          <w:szCs w:val="22"/>
-          <w:lang w:val="es-CR"/>
-        </w:rPr>
-        <w:t>Procedures</w:t>
-      </w:r>
-      <w:proofErr w:type="spellEnd"/>
-      <w:r>
-        <w:rPr>
-          <w:rFonts w:ascii="Arial" w:hAnsi="Arial" w:cs="Arial"/>
-          <w:sz w:val="22"/>
-          <w:szCs w:val="22"/>
-          <w:lang w:val="es-CR"/>
-        </w:rPr>
-        <w:t>.</w:t>
+        <w:t>Uso de Stored Procedures.</w:t>
       </w:r>
     </w:p>
     <w:p>
@@ -2787,7 +2358,7 @@
           <w:lang w:val="es-CR"/>
         </w:rPr>
         <w:pict w14:anchorId="01766939">
-          <v:rect id="_x0000_i1084" style="width:0;height:1.5pt" o:hralign="center" o:hrstd="t" o:hr="t"/>
+          <v:rect id="_x0000_i1028" style="width:0;height:1.5pt" o:hralign="center" o:hrstd="t" o:hr="t"/>
         </w:pict>
       </w:r>
     </w:p>
@@ -2808,21 +2379,7 @@
         <w:rPr>
           <w:lang w:val="es-CR"/>
         </w:rPr>
-        <w:t xml:space="preserve">(15 </w:t>
-      </w:r>
-      <w:proofErr w:type="spellStart"/>
-      <w:r>
-        <w:rPr>
-          <w:lang w:val="es-CR"/>
-        </w:rPr>
-        <w:t>pts</w:t>
-      </w:r>
-      <w:proofErr w:type="spellEnd"/>
-      <w:r>
-        <w:rPr>
-          <w:lang w:val="es-CR"/>
-        </w:rPr>
-        <w:t>)</w:t>
+        <w:t>(15 pts)</w:t>
       </w:r>
     </w:p>
     <w:p>
@@ -2845,7 +2402,7 @@
           <w:lang w:val="es-CR"/>
         </w:rPr>
         <w:pict w14:anchorId="6E37BAC2">
-          <v:rect id="_x0000_i1134" style="width:0;height:1.5pt" o:hralign="center" o:hrstd="t" o:hr="t"/>
+          <v:rect id="_x0000_i1029" style="width:0;height:1.5pt" o:hralign="center" o:hrstd="t" o:hr="t"/>
         </w:pict>
       </w:r>
     </w:p>
@@ -2970,336 +2527,7 @@
                 <w:szCs w:val="22"/>
                 <w:lang w:val="es-CR"/>
               </w:rPr>
-              <w:t xml:space="preserve">Job </w:t>
-            </w:r>
-            <w:proofErr w:type="spellStart"/>
-            <w:r>
-              <w:rPr>
-                <w:rFonts w:ascii="Arial" w:hAnsi="Arial" w:cs="Arial"/>
-                <w:sz w:val="22"/>
-                <w:szCs w:val="22"/>
-                <w:lang w:val="es-CR"/>
-              </w:rPr>
-              <w:t>backup</w:t>
-            </w:r>
-            <w:proofErr w:type="spellEnd"/>
-            <w:r>
-              <w:rPr>
-                <w:rFonts w:ascii="Arial" w:hAnsi="Arial" w:cs="Arial"/>
-                <w:sz w:val="22"/>
-                <w:szCs w:val="22"/>
-                <w:lang w:val="es-CR"/>
-              </w:rPr>
-              <w:t xml:space="preserve"> completo</w:t>
-            </w:r>
-          </w:p>
-        </w:tc>
-        <w:tc>
-          <w:tcPr>
-            <w:tcW w:w="0" w:type="auto"/>
-          </w:tcPr>
-          <w:p>
-            <w:pPr>
-              <w:pStyle w:val="Compact"/>
-              <w:jc w:val="both"/>
-              <w:rPr>
-                <w:rFonts w:ascii="Arial" w:hAnsi="Arial" w:cs="Arial"/>
-                <w:sz w:val="22"/>
-                <w:szCs w:val="22"/>
-                <w:lang w:val="es-CR"/>
-              </w:rPr>
-            </w:pPr>
-            <w:r>
-              <w:rPr>
-                <w:rFonts w:ascii="Arial" w:hAnsi="Arial" w:cs="Arial"/>
-                <w:sz w:val="22"/>
-                <w:szCs w:val="22"/>
-                <w:lang w:val="es-CR"/>
-              </w:rPr>
-              <w:t>25</w:t>
-            </w:r>
-            <w:r>
-              <w:rPr>
-                <w:rFonts w:ascii="Arial" w:hAnsi="Arial" w:cs="Arial"/>
-                <w:sz w:val="22"/>
-                <w:szCs w:val="22"/>
-                <w:lang w:val="es-CR"/>
-              </w:rPr>
-              <w:t xml:space="preserve"> </w:t>
-            </w:r>
-            <w:proofErr w:type="spellStart"/>
-            <w:r>
-              <w:rPr>
-                <w:rFonts w:ascii="Arial" w:hAnsi="Arial" w:cs="Arial"/>
-                <w:sz w:val="22"/>
-                <w:szCs w:val="22"/>
-                <w:lang w:val="es-CR"/>
-              </w:rPr>
-              <w:t>pts</w:t>
-            </w:r>
-            <w:proofErr w:type="spellEnd"/>
-          </w:p>
-        </w:tc>
-      </w:tr>
-      <w:tr>
-        <w:tc>
-          <w:tcPr>
-            <w:tcW w:w="0" w:type="auto"/>
-          </w:tcPr>
-          <w:p>
-            <w:pPr>
-              <w:pStyle w:val="Compact"/>
-              <w:jc w:val="both"/>
-              <w:rPr>
-                <w:rFonts w:ascii="Arial" w:hAnsi="Arial" w:cs="Arial"/>
-                <w:sz w:val="22"/>
-                <w:szCs w:val="22"/>
-                <w:lang w:val="es-CR"/>
-              </w:rPr>
-            </w:pPr>
-            <w:r>
-              <w:rPr>
-                <w:rFonts w:ascii="Arial" w:hAnsi="Arial" w:cs="Arial"/>
-                <w:sz w:val="22"/>
-                <w:szCs w:val="22"/>
-                <w:lang w:val="es-CR"/>
-              </w:rPr>
-              <w:t xml:space="preserve">Job </w:t>
-            </w:r>
-            <w:proofErr w:type="spellStart"/>
-            <w:r>
-              <w:rPr>
-                <w:rFonts w:ascii="Arial" w:hAnsi="Arial" w:cs="Arial"/>
-                <w:sz w:val="22"/>
-                <w:szCs w:val="22"/>
-                <w:lang w:val="es-CR"/>
-              </w:rPr>
-              <w:t>backup</w:t>
-            </w:r>
-            <w:proofErr w:type="spellEnd"/>
-            <w:r>
-              <w:rPr>
-                <w:rFonts w:ascii="Arial" w:hAnsi="Arial" w:cs="Arial"/>
-                <w:sz w:val="22"/>
-                <w:szCs w:val="22"/>
-                <w:lang w:val="es-CR"/>
-              </w:rPr>
-              <w:t xml:space="preserve"> incremental</w:t>
-            </w:r>
-          </w:p>
-        </w:tc>
-        <w:tc>
-          <w:tcPr>
-            <w:tcW w:w="0" w:type="auto"/>
-          </w:tcPr>
-          <w:p>
-            <w:pPr>
-              <w:pStyle w:val="Compact"/>
-              <w:jc w:val="both"/>
-              <w:rPr>
-                <w:rFonts w:ascii="Arial" w:hAnsi="Arial" w:cs="Arial"/>
-                <w:sz w:val="22"/>
-                <w:szCs w:val="22"/>
-                <w:lang w:val="es-CR"/>
-              </w:rPr>
-            </w:pPr>
-            <w:r>
-              <w:rPr>
-                <w:rFonts w:ascii="Arial" w:hAnsi="Arial" w:cs="Arial"/>
-                <w:sz w:val="22"/>
-                <w:szCs w:val="22"/>
-                <w:lang w:val="es-CR"/>
-              </w:rPr>
-              <w:t xml:space="preserve">25 </w:t>
-            </w:r>
-            <w:proofErr w:type="spellStart"/>
-            <w:r>
-              <w:rPr>
-                <w:rFonts w:ascii="Arial" w:hAnsi="Arial" w:cs="Arial"/>
-                <w:sz w:val="22"/>
-                <w:szCs w:val="22"/>
-                <w:lang w:val="es-CR"/>
-              </w:rPr>
-              <w:t>pts</w:t>
-            </w:r>
-            <w:proofErr w:type="spellEnd"/>
-          </w:p>
-        </w:tc>
-      </w:tr>
-      <w:tr>
-        <w:tc>
-          <w:tcPr>
-            <w:tcW w:w="0" w:type="auto"/>
-          </w:tcPr>
-          <w:p>
-            <w:pPr>
-              <w:pStyle w:val="Compact"/>
-              <w:jc w:val="both"/>
-              <w:rPr>
-                <w:rFonts w:ascii="Arial" w:hAnsi="Arial" w:cs="Arial"/>
-                <w:sz w:val="22"/>
-                <w:szCs w:val="22"/>
-                <w:lang w:val="es-CR"/>
-              </w:rPr>
-            </w:pPr>
-            <w:r>
-              <w:rPr>
-                <w:rFonts w:ascii="Arial" w:hAnsi="Arial" w:cs="Arial"/>
-                <w:sz w:val="22"/>
-                <w:szCs w:val="22"/>
-                <w:lang w:val="es-CR"/>
-              </w:rPr>
-              <w:t>Alerta ante fallos</w:t>
-            </w:r>
-          </w:p>
-        </w:tc>
-        <w:tc>
-          <w:tcPr>
-            <w:tcW w:w="0" w:type="auto"/>
-          </w:tcPr>
-          <w:p>
-            <w:pPr>
-              <w:pStyle w:val="Compact"/>
-              <w:jc w:val="both"/>
-              <w:rPr>
-                <w:rFonts w:ascii="Arial" w:hAnsi="Arial" w:cs="Arial"/>
-                <w:sz w:val="22"/>
-                <w:szCs w:val="22"/>
-                <w:lang w:val="es-CR"/>
-              </w:rPr>
-            </w:pPr>
-            <w:r>
-              <w:rPr>
-                <w:rFonts w:ascii="Arial" w:hAnsi="Arial" w:cs="Arial"/>
-                <w:sz w:val="22"/>
-                <w:szCs w:val="22"/>
-                <w:lang w:val="es-CR"/>
-              </w:rPr>
-              <w:t xml:space="preserve">20 </w:t>
-            </w:r>
-            <w:proofErr w:type="spellStart"/>
-            <w:r>
-              <w:rPr>
-                <w:rFonts w:ascii="Arial" w:hAnsi="Arial" w:cs="Arial"/>
-                <w:sz w:val="22"/>
-                <w:szCs w:val="22"/>
-                <w:lang w:val="es-CR"/>
-              </w:rPr>
-              <w:t>pts</w:t>
-            </w:r>
-            <w:proofErr w:type="spellEnd"/>
-          </w:p>
-        </w:tc>
-      </w:tr>
-      <w:tr>
-        <w:tc>
-          <w:tcPr>
-            <w:tcW w:w="0" w:type="auto"/>
-          </w:tcPr>
-          <w:p>
-            <w:pPr>
-              <w:pStyle w:val="Compact"/>
-              <w:jc w:val="both"/>
-              <w:rPr>
-                <w:rFonts w:ascii="Arial" w:hAnsi="Arial" w:cs="Arial"/>
-                <w:sz w:val="22"/>
-                <w:szCs w:val="22"/>
-                <w:lang w:val="es-CR"/>
-              </w:rPr>
-            </w:pPr>
-            <w:r>
-              <w:rPr>
-                <w:rFonts w:ascii="Arial" w:hAnsi="Arial" w:cs="Arial"/>
-                <w:sz w:val="22"/>
-                <w:szCs w:val="22"/>
-                <w:lang w:val="es-CR"/>
-              </w:rPr>
-              <w:t xml:space="preserve">Ventana de </w:t>
-            </w:r>
-            <w:proofErr w:type="spellStart"/>
-            <w:r>
-              <w:rPr>
-                <w:rFonts w:ascii="Arial" w:hAnsi="Arial" w:cs="Arial"/>
-                <w:sz w:val="22"/>
-                <w:szCs w:val="22"/>
-                <w:lang w:val="es-CR"/>
-              </w:rPr>
-              <w:t>profiler</w:t>
-            </w:r>
-            <w:proofErr w:type="spellEnd"/>
-          </w:p>
-        </w:tc>
-        <w:tc>
-          <w:tcPr>
-            <w:tcW w:w="0" w:type="auto"/>
-          </w:tcPr>
-          <w:p>
-            <w:pPr>
-              <w:pStyle w:val="Compact"/>
-              <w:jc w:val="both"/>
-              <w:rPr>
-                <w:rFonts w:ascii="Arial" w:hAnsi="Arial" w:cs="Arial"/>
-                <w:sz w:val="22"/>
-                <w:szCs w:val="22"/>
-                <w:lang w:val="es-CR"/>
-              </w:rPr>
-            </w:pPr>
-            <w:r>
-              <w:rPr>
-                <w:rFonts w:ascii="Arial" w:hAnsi="Arial" w:cs="Arial"/>
-                <w:sz w:val="22"/>
-                <w:szCs w:val="22"/>
-                <w:lang w:val="es-CR"/>
-              </w:rPr>
-              <w:t>5</w:t>
-            </w:r>
-            <w:r>
-              <w:rPr>
-                <w:rFonts w:ascii="Arial" w:hAnsi="Arial" w:cs="Arial"/>
-                <w:sz w:val="22"/>
-                <w:szCs w:val="22"/>
-                <w:lang w:val="es-CR"/>
-              </w:rPr>
-              <w:t xml:space="preserve"> </w:t>
-            </w:r>
-            <w:proofErr w:type="spellStart"/>
-            <w:r>
-              <w:rPr>
-                <w:rFonts w:ascii="Arial" w:hAnsi="Arial" w:cs="Arial"/>
-                <w:sz w:val="22"/>
-                <w:szCs w:val="22"/>
-                <w:lang w:val="es-CR"/>
-              </w:rPr>
-              <w:t>pts</w:t>
-            </w:r>
-            <w:proofErr w:type="spellEnd"/>
-          </w:p>
-        </w:tc>
-      </w:tr>
-      <w:tr>
-        <w:tc>
-          <w:tcPr>
-            <w:tcW w:w="0" w:type="auto"/>
-          </w:tcPr>
-          <w:p>
-            <w:pPr>
-              <w:pStyle w:val="Compact"/>
-              <w:jc w:val="both"/>
-              <w:rPr>
-                <w:rFonts w:ascii="Arial" w:hAnsi="Arial" w:cs="Arial"/>
-                <w:sz w:val="22"/>
-                <w:szCs w:val="22"/>
-                <w:lang w:val="es-CR"/>
-              </w:rPr>
-            </w:pPr>
-            <w:r>
-              <w:rPr>
-                <w:rFonts w:ascii="Arial" w:hAnsi="Arial" w:cs="Arial"/>
-                <w:sz w:val="22"/>
-                <w:szCs w:val="22"/>
-                <w:lang w:val="es-CR"/>
-              </w:rPr>
-              <w:t>Replicación de la base de datos</w:t>
+              <w:t>Job backup completo</w:t>
             </w:r>
           </w:p>
         </w:tc>
@@ -3355,6 +2583,15 @@
                 <w:lang w:val="es-CR"/>
               </w:rPr>
             </w:pPr>
+            <w:r>
+              <w:rPr>
+                <w:rFonts w:ascii="Arial" w:hAnsi="Arial" w:cs="Arial"/>
+                <w:sz w:val="22"/>
+                <w:szCs w:val="22"/>
+                <w:lang w:val="es-CR"/>
+              </w:rPr>
+              <w:t>Job backup incremental</w:t>
+            </w:r>
           </w:p>
         </w:tc>
         <w:tc>
@@ -3372,6 +2609,15 @@
                 <w:lang w:val="es-CR"/>
               </w:rPr>
             </w:pPr>
+            <w:r>
+              <w:rPr>
+                <w:rFonts w:ascii="Arial" w:hAnsi="Arial" w:cs="Arial"/>
+                <w:sz w:val="22"/>
+                <w:szCs w:val="22"/>
+                <w:lang w:val="es-CR"/>
+              </w:rPr>
+              <w:t>25 pts</w:t>
+            </w:r>
           </w:p>
         </w:tc>
       </w:tr>
@@ -3398,6 +2644,249 @@
                 <w:szCs w:val="22"/>
                 <w:lang w:val="es-CR"/>
               </w:rPr>
+              <w:t>Alerta ante fallos</w:t>
+            </w:r>
+          </w:p>
+        </w:tc>
+        <w:tc>
+          <w:tcPr>
+            <w:tcW w:w="0" w:type="auto"/>
+          </w:tcPr>
+          <w:p>
+            <w:pPr>
+              <w:pStyle w:val="Compact"/>
+              <w:jc w:val="both"/>
+              <w:rPr>
+                <w:rFonts w:ascii="Arial" w:hAnsi="Arial" w:cs="Arial"/>
+                <w:sz w:val="22"/>
+                <w:szCs w:val="22"/>
+                <w:lang w:val="es-CR"/>
+              </w:rPr>
+            </w:pPr>
+            <w:r>
+              <w:rPr>
+                <w:rFonts w:ascii="Arial" w:hAnsi="Arial" w:cs="Arial"/>
+                <w:sz w:val="22"/>
+                <w:szCs w:val="22"/>
+                <w:lang w:val="es-CR"/>
+              </w:rPr>
+              <w:t>20 pts</w:t>
+            </w:r>
+          </w:p>
+        </w:tc>
+      </w:tr>
+      <w:tr>
+        <w:tc>
+          <w:tcPr>
+            <w:tcW w:w="0" w:type="auto"/>
+          </w:tcPr>
+          <w:p>
+            <w:pPr>
+              <w:pStyle w:val="Compact"/>
+              <w:jc w:val="both"/>
+              <w:rPr>
+                <w:rFonts w:ascii="Arial" w:hAnsi="Arial" w:cs="Arial"/>
+                <w:sz w:val="22"/>
+                <w:szCs w:val="22"/>
+                <w:lang w:val="es-CR"/>
+              </w:rPr>
+            </w:pPr>
+            <w:r>
+              <w:rPr>
+                <w:rFonts w:ascii="Arial" w:hAnsi="Arial" w:cs="Arial"/>
+                <w:sz w:val="22"/>
+                <w:szCs w:val="22"/>
+                <w:lang w:val="es-CR"/>
+              </w:rPr>
+              <w:t>Ventana de profiler</w:t>
+            </w:r>
+          </w:p>
+        </w:tc>
+        <w:tc>
+          <w:tcPr>
+            <w:tcW w:w="0" w:type="auto"/>
+          </w:tcPr>
+          <w:p>
+            <w:pPr>
+              <w:pStyle w:val="Compact"/>
+              <w:jc w:val="both"/>
+              <w:rPr>
+                <w:rFonts w:ascii="Arial" w:hAnsi="Arial" w:cs="Arial"/>
+                <w:sz w:val="22"/>
+                <w:szCs w:val="22"/>
+                <w:lang w:val="es-CR"/>
+              </w:rPr>
+            </w:pPr>
+            <w:r>
+              <w:rPr>
+                <w:rFonts w:ascii="Arial" w:hAnsi="Arial" w:cs="Arial"/>
+                <w:sz w:val="22"/>
+                <w:szCs w:val="22"/>
+                <w:lang w:val="es-CR"/>
+              </w:rPr>
+              <w:t>5</w:t>
+            </w:r>
+            <w:r>
+              <w:rPr>
+                <w:rFonts w:ascii="Arial" w:hAnsi="Arial" w:cs="Arial"/>
+                <w:sz w:val="22"/>
+                <w:szCs w:val="22"/>
+                <w:lang w:val="es-CR"/>
+              </w:rPr>
+              <w:t xml:space="preserve"> pts</w:t>
+            </w:r>
+          </w:p>
+        </w:tc>
+      </w:tr>
+      <w:tr>
+        <w:tc>
+          <w:tcPr>
+            <w:tcW w:w="0" w:type="auto"/>
+          </w:tcPr>
+          <w:p>
+            <w:pPr>
+              <w:pStyle w:val="Compact"/>
+              <w:jc w:val="both"/>
+              <w:rPr>
+                <w:rFonts w:ascii="Arial" w:hAnsi="Arial" w:cs="Arial"/>
+                <w:sz w:val="22"/>
+                <w:szCs w:val="22"/>
+                <w:lang w:val="es-CR"/>
+              </w:rPr>
+            </w:pPr>
+            <w:r>
+              <w:rPr>
+                <w:rFonts w:ascii="Arial" w:hAnsi="Arial" w:cs="Arial"/>
+                <w:sz w:val="22"/>
+                <w:szCs w:val="22"/>
+                <w:lang w:val="es-CR"/>
+              </w:rPr>
+              <w:t>Replicación de la base de datos</w:t>
+            </w:r>
+          </w:p>
+        </w:tc>
+        <w:tc>
+          <w:tcPr>
+            <w:tcW w:w="0" w:type="auto"/>
+          </w:tcPr>
+          <w:p>
+            <w:pPr>
+              <w:pStyle w:val="Compact"/>
+              <w:jc w:val="both"/>
+              <w:rPr>
+                <w:rFonts w:ascii="Arial" w:hAnsi="Arial" w:cs="Arial"/>
+                <w:sz w:val="22"/>
+                <w:szCs w:val="22"/>
+                <w:lang w:val="es-CR"/>
+              </w:rPr>
+            </w:pPr>
+            <w:r>
+              <w:rPr>
+                <w:rFonts w:ascii="Arial" w:hAnsi="Arial" w:cs="Arial"/>
+                <w:sz w:val="22"/>
+                <w:szCs w:val="22"/>
+                <w:lang w:val="es-CR"/>
+              </w:rPr>
+              <w:t>2</w:t>
+            </w:r>
+            <w:r>
+              <w:rPr>
+                <w:rFonts w:ascii="Arial" w:hAnsi="Arial" w:cs="Arial"/>
+                <w:sz w:val="22"/>
+                <w:szCs w:val="22"/>
+                <w:lang w:val="es-CR"/>
+              </w:rPr>
+              <w:t>0</w:t>
+            </w:r>
+            <w:r>
+              <w:rPr>
+                <w:rFonts w:ascii="Arial" w:hAnsi="Arial" w:cs="Arial"/>
+                <w:sz w:val="22"/>
+                <w:szCs w:val="22"/>
+                <w:lang w:val="es-CR"/>
+              </w:rPr>
+              <w:t xml:space="preserve"> pts</w:t>
+            </w:r>
+          </w:p>
+        </w:tc>
+      </w:tr>
+      <w:tr>
+        <w:tc>
+          <w:tcPr>
+            <w:tcW w:w="0" w:type="auto"/>
+          </w:tcPr>
+          <w:p>
+            <w:pPr>
+              <w:pStyle w:val="Compact"/>
+              <w:jc w:val="both"/>
+              <w:rPr>
+                <w:rFonts w:ascii="Arial" w:hAnsi="Arial" w:cs="Arial"/>
+                <w:sz w:val="22"/>
+                <w:szCs w:val="22"/>
+                <w:lang w:val="es-CR"/>
+              </w:rPr>
+            </w:pPr>
+            <w:r>
+              <w:rPr>
+                <w:rFonts w:ascii="Arial" w:hAnsi="Arial" w:cs="Arial"/>
+                <w:sz w:val="22"/>
+                <w:szCs w:val="22"/>
+                <w:lang w:val="es-CR"/>
+              </w:rPr>
+              <w:t>Backups en el repositorio</w:t>
+            </w:r>
+          </w:p>
+        </w:tc>
+        <w:tc>
+          <w:tcPr>
+            <w:tcW w:w="0" w:type="auto"/>
+          </w:tcPr>
+          <w:p>
+            <w:pPr>
+              <w:pStyle w:val="Compact"/>
+              <w:jc w:val="both"/>
+              <w:rPr>
+                <w:rFonts w:ascii="Arial" w:hAnsi="Arial" w:cs="Arial"/>
+                <w:sz w:val="22"/>
+                <w:szCs w:val="22"/>
+                <w:lang w:val="es-CR"/>
+              </w:rPr>
+            </w:pPr>
+            <w:r>
+              <w:rPr>
+                <w:rFonts w:ascii="Arial" w:hAnsi="Arial" w:cs="Arial"/>
+                <w:sz w:val="22"/>
+                <w:szCs w:val="22"/>
+                <w:lang w:val="es-CR"/>
+              </w:rPr>
+              <w:t>5 pts</w:t>
+            </w:r>
+          </w:p>
+        </w:tc>
+      </w:tr>
+      <w:tr>
+        <w:tc>
+          <w:tcPr>
+            <w:tcW w:w="0" w:type="auto"/>
+          </w:tcPr>
+          <w:p>
+            <w:pPr>
+              <w:pStyle w:val="Compact"/>
+              <w:jc w:val="both"/>
+              <w:rPr>
+                <w:rFonts w:ascii="Arial" w:hAnsi="Arial" w:cs="Arial"/>
+                <w:sz w:val="22"/>
+                <w:szCs w:val="22"/>
+                <w:lang w:val="es-CR"/>
+              </w:rPr>
+            </w:pPr>
+            <w:r>
+              <w:rPr>
+                <w:rFonts w:ascii="Arial" w:hAnsi="Arial" w:cs="Arial"/>
+                <w:sz w:val="22"/>
+                <w:szCs w:val="22"/>
+                <w:lang w:val="es-CR"/>
+              </w:rPr>
               <w:t>Total</w:t>
             </w:r>
           </w:p>
@@ -3424,19 +2913,8 @@
                 <w:szCs w:val="22"/>
                 <w:lang w:val="es-CR"/>
               </w:rPr>
-              <w:t xml:space="preserve">100 </w:t>
+              <w:t>100 pts</w:t>
             </w:r>
-            <w:proofErr w:type="spellStart"/>
-            <w:r>
-              <w:rPr>
-                <w:rFonts w:ascii="Arial" w:hAnsi="Arial" w:cs="Arial"/>
-                <w:sz w:val="22"/>
-                <w:szCs w:val="22"/>
-                <w:lang w:val="es-CR"/>
-              </w:rPr>
-              <w:t>pts</w:t>
-            </w:r>
-            <w:proofErr w:type="spellEnd"/>
           </w:p>
         </w:tc>
       </w:tr>
@@ -3453,7 +2931,7 @@
           <w:lang w:val="es-CR"/>
         </w:rPr>
         <w:pict w14:anchorId="36AF528D">
-          <v:rect id="_x0000_i1085" style="width:0;height:1.5pt" o:hralign="center" o:hrstd="t" o:hr="t"/>
+          <v:rect id="_x0000_i1030" style="width:0;height:1.5pt" o:hralign="center" o:hrstd="t" o:hr="t"/>
         </w:pict>
       </w:r>
     </w:p>

</xml_diff>